<commit_message>
fix: arreglo de las rutas para los test funcionales y no funcionales
</commit_message>
<xml_diff>
--- a/backend/Reportes/Reporte_.docx
+++ b/backend/Reportes/Reporte_.docx
@@ -9,12 +9,12 @@
           <w:color w:val="003366"/>
           <w:sz w:val="28"/>
         </w:rPr>
-        <w:t>Test: Ver Stock</w:t>
+        <w:t>Test: Verificar flujos alternos</w:t>
       </w:r>
     </w:p>
     <w:p>
       <w:r>
-        <w:t>Fecha de ejecución técnica: 06/06/2026 19:36</w:t>
+        <w:t>Fecha de ejecución técnica: 06/06/2026 20:40</w:t>
       </w:r>
     </w:p>
     <w:tbl>
@@ -34,7 +34,7 @@
           </w:tcPr>
           <w:p>
             <w:r>
-              <w:t>Título: Ver Stock</w:t>
+              <w:t>Título: Verificar flujos alternos</w:t>
             </w:r>
           </w:p>
         </w:tc>
@@ -79,7 +79,7 @@
           </w:tcPr>
           <w:p>
             <w:r>
-              <w:t>Caso de Uso perteneciente: Ver Stock</w:t>
+              <w:t>Caso de Uso perteneciente: Gestión de inventario</w:t>
             </w:r>
           </w:p>
         </w:tc>
@@ -91,7 +91,7 @@
           </w:tcPr>
           <w:p>
             <w:r>
-              <w:t>Módulo: Stock</w:t>
+              <w:t>Módulo: inventario</w:t>
             </w:r>
           </w:p>
         </w:tc>
@@ -114,7 +114,7 @@
           </w:tcPr>
           <w:p>
             <w:r>
-              <w:t>Descripción: Verifica la correcta visualización del listado de productos en stock, incluyendo sus detalles y la integración con agentes inteligentes.</w:t>
+              <w:t>Descripción: Validación automática del flujo: Verificar flujos alternos</w:t>
             </w:r>
           </w:p>
         </w:tc>
@@ -126,7 +126,7 @@
           </w:tcPr>
           <w:p>
             <w:r>
-              <w:t>Datos Requeridos: Credenciales de usuario con rol de 'Administrador' o 'Gestor de Inventario'. Al menos 3 productos preexistentes en el inventario con diferentes cantidades y estados.</w:t>
+              <w:t>Datos Requeridos: Datos válidos de prueba</w:t>
             </w:r>
           </w:p>
         </w:tc>
@@ -136,7 +136,7 @@
           </w:tcPr>
           <w:p>
             <w:r>
-              <w:t>Prerrequisitos: El sistema de inventario debe estar desplegado y accesible. El usuario debe tener una cuenta activa con los permisos necesarios. Deben existir productos registrados en el inventario.</w:t>
+              <w:t>Prerrequisitos: Sistema accesible</w:t>
             </w:r>
           </w:p>
         </w:tc>
@@ -149,7 +149,7 @@
           </w:tcPr>
           <w:p>
             <w:r>
-              <w:t>Postcondiciones: El usuario ha visualizado correctamente el listado de stock. No se realizan cambios en los datos del inventario.</w:t>
+              <w:t>Postcondiciones: El flujo finaliza sin errores</w:t>
             </w:r>
           </w:p>
         </w:tc>
@@ -158,7 +158,7 @@
     <w:p/>
     <w:p>
       <w:r>
-        <w:t>Notas: Se asume que la interfaz de usuario está construida con Vue.js y que los agentes inteligentes interactúan con la visualización de alguna manera (ej. alertas, sugerencias).</w:t>
+        <w:t>Notas: Generado mediante plantilla de respaldo debido a fallo de IA</w:t>
       </w:r>
     </w:p>
     <w:p/>
@@ -294,7 +294,7 @@
           </w:tcPr>
           <w:p>
             <w:r>
-              <w:t>Iniciar sesión en el sistema web con credenciales de un usuario con permisos para gestionar/ver el inventario.</w:t>
+              <w:t>Navegar al módulo de inventario</w:t>
             </w:r>
           </w:p>
         </w:tc>
@@ -304,7 +304,7 @@
           </w:tcPr>
           <w:p>
             <w:r>
-              <w:t>El usuario es redirigido exitosamente al dashboard o página principal del sistema.</w:t>
+              <w:t>La vista carga correctamente</w:t>
             </w:r>
           </w:p>
         </w:tc>
@@ -314,7 +314,7 @@
           </w:tcPr>
           <w:p>
             <w:r>
-              <w:t>El usuario es redirigido exitosamente al dashboard o página principal del sistema.</w:t>
+              <w:t>La vista carga correctamente</w:t>
             </w:r>
           </w:p>
         </w:tc>
@@ -354,7 +354,7 @@
           </w:tcPr>
           <w:p>
             <w:r>
-              <w:t>Navegar a la sección 'Stock' o 'Inventario' utilizando el menú de navegación principal.</w:t>
+              <w:t>Ejecutar acción: Verificar flujos alternos</w:t>
             </w:r>
           </w:p>
         </w:tc>
@@ -364,7 +364,7 @@
           </w:tcPr>
           <w:p>
             <w:r>
-              <w:t>La página de 'Stock' se carga mostrando una tabla o lista de todos los productos en inventario.</w:t>
+              <w:t>El sistema procesa la solicitud sin errores</w:t>
             </w:r>
           </w:p>
         </w:tc>
@@ -374,7 +374,7 @@
           </w:tcPr>
           <w:p>
             <w:r>
-              <w:t>La página de 'Stock' se carga mostrando una tabla o lista de todos los productos en inventario.</w:t>
+              <w:t>El sistema procesa la solicitud sin errores</w:t>
             </w:r>
           </w:p>
         </w:tc>
@@ -414,7 +414,7 @@
           </w:tcPr>
           <w:p>
             <w:r>
-              <w:t>Verificar que la tabla de stock muestra las columnas esperadas (ej. 'Nombre del Producto', 'SKU', 'Cantidad Disponible', 'Precio Unitario', 'Ubicación', 'Estado') y que los datos de los productos son correctos y legibles.</w:t>
+              <w:t>Verificar confirmación visual</w:t>
             </w:r>
           </w:p>
         </w:tc>
@@ -424,7 +424,7 @@
           </w:tcPr>
           <w:p>
             <w:r>
-              <w:t>Todas las columnas relevantes son visibles y los datos de los productos (al menos los 3 preexistentes) se muestran con sus valores correctos.</w:t>
+              <w:t>Se muestra un mensaje o cambio indicando éxito</w:t>
             </w:r>
           </w:p>
         </w:tc>
@@ -434,67 +434,7 @@
           </w:tcPr>
           <w:p>
             <w:r>
-              <w:t>Todas las columnas relevantes son visibles y los datos de los productos (al menos los 3 preexistentes) se muestran con sus valores correctos.</w:t>
-            </w:r>
-          </w:p>
-        </w:tc>
-        <w:tc>
-          <w:tcPr>
-            <w:tcW w:type="dxa" w:w="1440"/>
-          </w:tcPr>
-          <w:p>
-            <w:r/>
-          </w:p>
-        </w:tc>
-        <w:tc>
-          <w:tcPr>
-            <w:tcW w:type="dxa" w:w="1440"/>
-          </w:tcPr>
-          <w:p>
-            <w:r>
-              <w:t>PASA</w:t>
-            </w:r>
-          </w:p>
-        </w:tc>
-      </w:tr>
-      <w:tr>
-        <w:tc>
-          <w:tcPr>
-            <w:tcW w:type="dxa" w:w="1440"/>
-          </w:tcPr>
-          <w:p>
-            <w:r>
-              <w:t>4</w:t>
-            </w:r>
-          </w:p>
-        </w:tc>
-        <w:tc>
-          <w:tcPr>
-            <w:tcW w:type="dxa" w:w="1440"/>
-          </w:tcPr>
-          <w:p>
-            <w:r>
-              <w:t>Observar la presencia de cualquier indicador visual o alerta generada por los agentes inteligentes (ej. productos con bajo stock resaltados, sugerencias de reabastecimiento, alertas de caducidad).</w:t>
-            </w:r>
-          </w:p>
-        </w:tc>
-        <w:tc>
-          <w:tcPr>
-            <w:tcW w:type="dxa" w:w="1440"/>
-          </w:tcPr>
-          <w:p>
-            <w:r>
-              <w:t>Se muestran correctamente las alertas o sugerencias de los agentes inteligentes, si aplica a los productos en el inventario (ej. un producto con cantidad baja muestra una alerta).</w:t>
-            </w:r>
-          </w:p>
-        </w:tc>
-        <w:tc>
-          <w:tcPr>
-            <w:tcW w:type="dxa" w:w="1440"/>
-          </w:tcPr>
-          <w:p>
-            <w:r>
-              <w:t>Se muestran correctamente las alertas o sugerencias de los agentes inteligentes, si aplica a los productos en el inventario (ej. un producto con cantidad baja muestra una alerta).</w:t>
+              <w:t>Se muestra un mensaje o cambio indicando éxito</w:t>
             </w:r>
           </w:p>
         </w:tc>
@@ -629,7 +569,7 @@
           </w:tcPr>
           <w:p>
             <w:r>
-              <w:t>Iniciar sesión en el sistema web con credenciales de un usuario con permisos para gestionar/ver el inventario.</w:t>
+              <w:t>Navegar al módulo de inventario</w:t>
             </w:r>
           </w:p>
         </w:tc>
@@ -667,7 +607,7 @@
           </w:tcPr>
           <w:p>
             <w:r>
-              <w:t>Navegar a la sección 'Stock' o 'Inventario' utilizando el menú de navegación principal.</w:t>
+              <w:t>Ejecutar acción: Verificar flujos alternos</w:t>
             </w:r>
           </w:p>
         </w:tc>
@@ -705,45 +645,7 @@
           </w:tcPr>
           <w:p>
             <w:r>
-              <w:t>Verificar que la tabla de stock muestra las columnas esperadas (ej. 'Nombre del Producto', 'SKU', 'Cantidad Disponible', 'Precio Unitario', 'Ubicación', 'Estado') y que los datos de los productos son correctos y legibles.</w:t>
-            </w:r>
-          </w:p>
-        </w:tc>
-        <w:tc>
-          <w:tcPr>
-            <w:tcW w:type="dxa" w:w="2160"/>
-          </w:tcPr>
-          <w:p>
-            <w:r>
-              <w:t>Validación UI correcta en http://localhost:5173</w:t>
-            </w:r>
-          </w:p>
-        </w:tc>
-        <w:tc>
-          <w:tcPr>
-            <w:tcW w:type="dxa" w:w="2160"/>
-          </w:tcPr>
-          <w:p/>
-        </w:tc>
-      </w:tr>
-      <w:tr>
-        <w:tc>
-          <w:tcPr>
-            <w:tcW w:type="dxa" w:w="2160"/>
-          </w:tcPr>
-          <w:p>
-            <w:r>
-              <w:t>4</w:t>
-            </w:r>
-          </w:p>
-        </w:tc>
-        <w:tc>
-          <w:tcPr>
-            <w:tcW w:type="dxa" w:w="2160"/>
-          </w:tcPr>
-          <w:p>
-            <w:r>
-              <w:t>Observar la presencia de cualquier indicador visual o alerta generada por los agentes inteligentes (ej. productos con bajo stock resaltados, sugerencias de reabastecimiento, alertas de caducidad).</w:t>
+              <w:t>Verificar confirmación visual</w:t>
             </w:r>
           </w:p>
         </w:tc>

</xml_diff>